<commit_message>
docs: Handbook v3.5 - Kap. 2 Konsistenzkorrektur (Handbook-Versionierung)
Reine Konsistenzkorrektur, keine inhaltliche Aenderung: "Handbook v3.4
-> Grundlage fuer Jarvis v0.6 (voraussichtlich)" war seit Abschluss von
v0.6 veraltet - "(voraussichtlich)" entfernt, da v0.6 jetzt tatsaechlich
abgeschlossen ist. Fehlende Zeile "Handbook v3.5 -> Grundlage fuer
Jarvis v0.7 (voraussichtlich)" ergaenzt.

Text-Diff gegen die zuvor committete Version bestaetigt: ausschliesslich
diese eine Zeile geaendert/ergaenzt, keine weiteren Abweichungen.
README/AI_START.md/PROJECT_STATE.md nicht angefasst (nicht betroffen).
Keine Code-Aenderung, 152/152 Tests unveraendert gruen.

Co-Authored-By: Claude Sonnet 5 <noreply@anthropic.com>
</commit_message>
<xml_diff>
--- a/docs/handbook/JARVIS_MASTER_HANDBOOK_v3_5.docx
+++ b/docs/handbook/JARVIS_MASTER_HANDBOOK_v3_5.docx
@@ -1098,7 +1098,15 @@
         <w:pStyle w:val="Compact"/>
       </w:pPr>
       <w:r>
-        <w:t>Handbook v3.4 → Grundlage für Jarvis v0.6 (voraussichtlich)</w:t>
+        <w:t>Handbook v3.4 → Grundlage für Jarvis v0.6</w:t>
+      </w:r>
+    </w:p>
+    <w:p>
+      <w:pPr>
+        <w:pStyle w:val="Compact"/>
+      </w:pPr>
+      <w:r>
+        <w:t>Handbook v3.5 → Grundlage für Jarvis v0.7 (voraussichtlich)</w:t>
       </w:r>
     </w:p>
     <w:p>

</xml_diff>